<commit_message>
form be filled finish eiei
</commit_message>
<xml_diff>
--- a/ฟอร์มรายงานผล/Word/แบคทีเรียวิทยา/2.Template ห้องปฏิบัติการแบคทีเรียวิทยา Ver Blind_VITEK2 with MIC.docx
+++ b/ฟอร์มรายงานผล/Word/แบคทีเรียวิทยา/2.Template ห้องปฏิบัติการแบคทีเรียวิทยา Ver Blind_VITEK2 with MIC.docx
@@ -92,7 +92,7 @@
           <w:p>
             <w:pPr>
               <w:rPr>
-                <w:rFonts w:ascii="TH SarabunPSK" w:hAnsi="TH SarabunPSK" w:cs="TH SarabunPSK" w:hint="cs"/>
+                <w:rFonts w:ascii="TH SarabunPSK" w:hAnsi="TH SarabunPSK" w:cs="TH SarabunPSK"/>
                 <w:b/>
                 <w:bCs/>
                 <w:sz w:val="32"/>
@@ -159,28 +159,7 @@
                 <w:szCs w:val="32"/>
                 <w:cs/>
               </w:rPr>
-              <w:t xml:space="preserve">หน้าที่ </w:t>
-            </w:r>
-            <w:r>
-              <w:rPr>
-                <w:rFonts w:ascii="TH SarabunPSK" w:hAnsi="TH SarabunPSK" w:cs="TH SarabunPSK"/>
-                <w:b/>
-                <w:bCs/>
-                <w:sz w:val="32"/>
-                <w:szCs w:val="32"/>
-              </w:rPr>
-              <w:t>2</w:t>
-            </w:r>
-            <w:r>
-              <w:rPr>
-                <w:rFonts w:ascii="TH SarabunPSK" w:hAnsi="TH SarabunPSK" w:cs="TH SarabunPSK"/>
-                <w:b/>
-                <w:bCs/>
-                <w:sz w:val="32"/>
-                <w:szCs w:val="32"/>
-                <w:cs/>
-              </w:rPr>
-              <w:t xml:space="preserve"> ของ</w:t>
+              <w:t>หน้าที่</w:t>
             </w:r>
             <w:r>
               <w:rPr>
@@ -194,34 +173,14 @@
             </w:r>
             <w:r>
               <w:rPr>
-                <w:rFonts w:ascii="TH SarabunPSK" w:hAnsi="TH SarabunPSK" w:cs="TH SarabunPSK"/>
-                <w:b/>
-                <w:bCs/>
-                <w:sz w:val="32"/>
-                <w:szCs w:val="32"/>
-                <w:cs/>
-              </w:rPr>
-              <w:t xml:space="preserve"> </w:t>
-            </w:r>
-            <w:r>
-              <w:rPr>
-                <w:rFonts w:ascii="TH SarabunPSK" w:hAnsi="TH SarabunPSK" w:cs="TH SarabunPSK"/>
-                <w:sz w:val="32"/>
-                <w:szCs w:val="32"/>
-                <w:cs/>
-              </w:rPr>
-              <w:t xml:space="preserve"> </w:t>
-            </w:r>
-            <w:r>
-              <w:rPr>
-                <w:rFonts w:ascii="TH SarabunPSK" w:hAnsi="TH SarabunPSK" w:cs="TH SarabunPSK"/>
-                <w:b/>
-                <w:bCs/>
-                <w:sz w:val="32"/>
-                <w:szCs w:val="32"/>
-                <w:cs/>
-              </w:rPr>
-              <w:t xml:space="preserve"> หน้า</w:t>
+                <w:rFonts w:ascii="TH SarabunPSK" w:hAnsi="TH SarabunPSK" w:cs="TH SarabunPSK" w:hint="cs"/>
+                <w:b/>
+                <w:bCs/>
+                <w:sz w:val="32"/>
+                <w:szCs w:val="32"/>
+                <w:cs/>
+              </w:rPr>
+              <w:t xml:space="preserve">1 </w:t>
             </w:r>
           </w:p>
         </w:tc>
@@ -357,7 +316,7 @@
                 <w:tab w:val="left" w:pos="1386"/>
               </w:tabs>
               <w:rPr>
-                <w:rFonts w:ascii="TH SarabunPSK" w:hAnsi="TH SarabunPSK" w:cs="TH SarabunPSK" w:hint="cs"/>
+                <w:rFonts w:ascii="TH SarabunPSK" w:hAnsi="TH SarabunPSK" w:cs="TH SarabunPSK"/>
                 <w:sz w:val="32"/>
                 <w:szCs w:val="32"/>
                 <w:cs/>

</xml_diff>